<commit_message>
report updated with diagrams
</commit_message>
<xml_diff>
--- a/doc/report.docx
+++ b/doc/report.docx
@@ -4,7 +4,7 @@
   <w:body>
     <w:p>
       <w:pPr>
-        <w:jc w:val="center"/>
+        <w:jc w:val="both"/>
         <w:rPr>
           <w:b/>
           <w:bCs/>
@@ -18,7 +18,7 @@
     </w:p>
     <w:p>
       <w:pPr>
-        <w:jc w:val="center"/>
+        <w:jc w:val="both"/>
         <w:rPr>
           <w:b/>
           <w:bCs/>
@@ -32,7 +32,7 @@
     </w:p>
     <w:p>
       <w:pPr>
-        <w:jc w:val="center"/>
+        <w:jc w:val="both"/>
         <w:rPr>
           <w:b/>
           <w:bCs/>
@@ -46,7 +46,7 @@
     </w:p>
     <w:p>
       <w:pPr>
-        <w:jc w:val="center"/>
+        <w:jc w:val="both"/>
         <w:rPr>
           <w:b/>
           <w:bCs/>
@@ -60,7 +60,7 @@
     </w:p>
     <w:p>
       <w:pPr>
-        <w:jc w:val="center"/>
+        <w:jc w:val="both"/>
         <w:rPr>
           <w:b/>
           <w:bCs/>
@@ -74,7 +74,7 @@
     </w:p>
     <w:p>
       <w:pPr>
-        <w:jc w:val="center"/>
+        <w:jc w:val="both"/>
         <w:rPr>
           <w:b/>
           <w:bCs/>
@@ -95,9 +95,12 @@
           <w:szCs w:val="60"/>
           <w:lang w:val="fr-CH"/>
         </w:rPr>
-        <w:t>ASAD</w:t>
-      </w:r>
-      <w:r>
+        <w:t>ASAD – Jeu de roulette</w:t>
+      </w:r>
+    </w:p>
+    <w:p>
+      <w:pPr>
+        <w:jc w:val="both"/>
         <w:rPr>
           <w:b/>
           <w:bCs/>
@@ -107,9 +110,11 @@
           <w:szCs w:val="60"/>
           <w:lang w:val="fr-CH"/>
         </w:rPr>
-        <w:t xml:space="preserve"> – </w:t>
-      </w:r>
-      <w:r>
+      </w:pPr>
+    </w:p>
+    <w:p>
+      <w:pPr>
+        <w:jc w:val="both"/>
         <w:rPr>
           <w:b/>
           <w:bCs/>
@@ -119,12 +124,11 @@
           <w:szCs w:val="60"/>
           <w:lang w:val="fr-CH"/>
         </w:rPr>
-        <w:t>Jeu de roulette</w:t>
-      </w:r>
-    </w:p>
-    <w:p>
-      <w:pPr>
-        <w:jc w:val="center"/>
+      </w:pPr>
+    </w:p>
+    <w:p>
+      <w:pPr>
+        <w:jc w:val="both"/>
         <w:rPr>
           <w:b/>
           <w:bCs/>
@@ -138,7 +142,7 @@
     </w:p>
     <w:p>
       <w:pPr>
-        <w:jc w:val="center"/>
+        <w:jc w:val="both"/>
         <w:rPr>
           <w:b/>
           <w:bCs/>
@@ -152,7 +156,7 @@
     </w:p>
     <w:p>
       <w:pPr>
-        <w:jc w:val="center"/>
+        <w:jc w:val="both"/>
         <w:rPr>
           <w:b/>
           <w:bCs/>
@@ -166,7 +170,7 @@
     </w:p>
     <w:p>
       <w:pPr>
-        <w:jc w:val="center"/>
+        <w:jc w:val="both"/>
         <w:rPr>
           <w:b/>
           <w:bCs/>
@@ -180,35 +184,7 @@
     </w:p>
     <w:p>
       <w:pPr>
-        <w:jc w:val="center"/>
-        <w:rPr>
-          <w:b/>
-          <w:bCs/>
-          <w:i/>
-          <w:iCs/>
-          <w:sz w:val="60"/>
-          <w:szCs w:val="60"/>
-          <w:lang w:val="fr-CH"/>
-        </w:rPr>
-      </w:pPr>
-    </w:p>
-    <w:p>
-      <w:pPr>
-        <w:jc w:val="center"/>
-        <w:rPr>
-          <w:b/>
-          <w:bCs/>
-          <w:i/>
-          <w:iCs/>
-          <w:sz w:val="60"/>
-          <w:szCs w:val="60"/>
-          <w:lang w:val="fr-CH"/>
-        </w:rPr>
-      </w:pPr>
-    </w:p>
-    <w:p>
-      <w:pPr>
-        <w:jc w:val="right"/>
+        <w:jc w:val="both"/>
         <w:rPr>
           <w:i/>
           <w:iCs/>
@@ -220,7 +196,7 @@
     </w:p>
     <w:p>
       <w:pPr>
-        <w:jc w:val="right"/>
+        <w:jc w:val="both"/>
         <w:rPr>
           <w:i/>
           <w:iCs/>
@@ -232,7 +208,7 @@
     </w:p>
     <w:p>
       <w:pPr>
-        <w:jc w:val="right"/>
+        <w:jc w:val="both"/>
         <w:rPr>
           <w:i/>
           <w:iCs/>
@@ -249,21 +225,12 @@
           <w:szCs w:val="28"/>
           <w:lang w:val="fr-CH"/>
         </w:rPr>
-        <w:t xml:space="preserve">Mouti Amir, N’dri Yao Anassa, </w:t>
-      </w:r>
-      <w:r>
-        <w:rPr>
-          <w:i/>
-          <w:iCs/>
-          <w:sz w:val="28"/>
-          <w:szCs w:val="28"/>
-          <w:lang w:val="fr-CH"/>
-        </w:rPr>
-        <w:t>Robin Steiger</w:t>
-      </w:r>
-    </w:p>
-    <w:p>
-      <w:pPr>
+        <w:t>Mouti Amir, N’dri Yao Anassa, Robin Steiger</w:t>
+      </w:r>
+    </w:p>
+    <w:p>
+      <w:pPr>
+        <w:jc w:val="both"/>
         <w:rPr>
           <w:b/>
           <w:bCs/>
@@ -307,11 +274,127 @@
           <w:szCs w:val="48"/>
           <w:lang w:val="fr-CH"/>
         </w:rPr>
+        <w:t>Introduction</w:t>
+      </w:r>
+    </w:p>
+    <w:p>
+      <w:pPr>
+        <w:jc w:val="both"/>
+        <w:rPr>
+          <w:lang w:val="fr-CH"/>
+        </w:rPr>
+      </w:pPr>
+      <w:r>
+        <w:rPr>
+          <w:lang w:val="fr-CH"/>
+        </w:rPr>
+        <w:t>Le but de ce travail pratique est de développer une application avec une architecture Data Centered</w:t>
+      </w:r>
+      <w:r>
+        <w:rPr>
+          <w:lang w:val="fr-CH"/>
+        </w:rPr>
+        <w:t>.</w:t>
+      </w:r>
+      <w:r>
+        <w:rPr>
+          <w:lang w:val="fr-CH"/>
+        </w:rPr>
+        <w:t xml:space="preserve"> Cela veut dire une architecture de type « blackboard », où la gestion des données est centralisée sur un « tableau noir ». Les communications entre les différents processus se fait à travers ce blackboard central, sur lequel ils lisent et écrivent toutes les données.</w:t>
+      </w:r>
+    </w:p>
+    <w:p>
+      <w:pPr>
+        <w:jc w:val="both"/>
+        <w:rPr>
+          <w:lang w:val="fr-CH"/>
+        </w:rPr>
+      </w:pPr>
+      <w:r>
+        <w:rPr>
+          <w:lang w:val="fr-CH"/>
+        </w:rPr>
+        <w:t>L’application que nous allons développer avec cette architecture est un jeu de roulette multijoueur. Les joueurs jouent sur un tapis partagé et chaque partie de roulette a une fenêtre de temps dans laquelle les joueurs peuvent miser sur des cases</w:t>
+      </w:r>
+      <w:r>
+        <w:rPr>
+          <w:lang w:val="fr-CH"/>
+        </w:rPr>
+        <w:t>. Chaque case ne peut accepter un pari d’un seul joueur à la fois et les joueurs peuvent modifier leurs paris pendant la fenêtre de temps imparti. Une fois le temps écoulé, le numéro gagnant est tiré et les gains et pertes sont calculées avant que la partie suivante commence.</w:t>
+      </w:r>
+    </w:p>
+    <w:p>
+      <w:pPr>
+        <w:jc w:val="both"/>
+        <w:rPr>
+          <w:lang w:val="fr-CH"/>
+        </w:rPr>
+      </w:pPr>
+      <w:r>
+        <w:rPr>
+          <w:b/>
+          <w:bCs/>
+          <w:i/>
+          <w:iCs/>
+          <w:sz w:val="48"/>
+          <w:szCs w:val="48"/>
+          <w:lang w:val="fr-CH"/>
+        </w:rPr>
+        <w:br w:type="page"/>
+      </w:r>
+    </w:p>
+    <w:p>
+      <w:pPr>
+        <w:jc w:val="both"/>
+        <w:rPr>
+          <w:b/>
+          <w:bCs/>
+          <w:i/>
+          <w:iCs/>
+          <w:sz w:val="48"/>
+          <w:szCs w:val="48"/>
+          <w:lang w:val="fr-CH"/>
+        </w:rPr>
+      </w:pPr>
+      <w:r>
+        <w:rPr>
+          <w:b/>
+          <w:bCs/>
+          <w:i/>
+          <w:iCs/>
+          <w:sz w:val="48"/>
+          <w:szCs w:val="48"/>
+          <w:lang w:val="fr-CH"/>
+        </w:rPr>
+        <w:lastRenderedPageBreak/>
+        <w:t>2</w:t>
+      </w:r>
+      <w:r>
+        <w:rPr>
+          <w:b/>
+          <w:bCs/>
+          <w:i/>
+          <w:iCs/>
+          <w:sz w:val="48"/>
+          <w:szCs w:val="48"/>
+          <w:lang w:val="fr-CH"/>
+        </w:rPr>
+        <w:t xml:space="preserve"> : </w:t>
+      </w:r>
+      <w:r>
+        <w:rPr>
+          <w:i/>
+          <w:iCs/>
+          <w:sz w:val="48"/>
+          <w:szCs w:val="48"/>
+          <w:lang w:val="fr-CH"/>
+        </w:rPr>
         <w:t>Modélisation</w:t>
       </w:r>
     </w:p>
     <w:p>
       <w:pPr>
+        <w:jc w:val="both"/>
         <w:rPr>
           <w:lang w:val="fr-CH"/>
         </w:rPr>
@@ -340,6 +423,1067 @@
         </w:rPr>
         <w:t>es use cases de notre système.</w:t>
       </w:r>
+      <w:r>
+        <w:rPr>
+          <w:lang w:val="fr-CH"/>
+        </w:rPr>
+        <w:t xml:space="preserve"> Pour se donner une première idée de la structure de notre application, nous avons décidé de définir en premier les fonctions présentes.</w:t>
+      </w:r>
+    </w:p>
+    <w:p>
+      <w:pPr>
+        <w:jc w:val="both"/>
+        <w:rPr>
+          <w:lang w:val="fr-CH"/>
+        </w:rPr>
+      </w:pPr>
+      <w:r>
+        <w:rPr>
+          <w:noProof/>
+          <w:lang w:val="fr-CH"/>
+        </w:rPr>
+        <w:drawing>
+          <wp:anchor distT="0" distB="0" distL="114300" distR="114300" simplePos="0" relativeHeight="251658240" behindDoc="0" locked="0" layoutInCell="1" allowOverlap="1" wp14:anchorId="2E06E71E" wp14:editId="00D32D3E">
+            <wp:simplePos x="0" y="0"/>
+            <wp:positionH relativeFrom="margin">
+              <wp:align>center</wp:align>
+            </wp:positionH>
+            <wp:positionV relativeFrom="margin">
+              <wp:posOffset>1847850</wp:posOffset>
+            </wp:positionV>
+            <wp:extent cx="5680075" cy="6654165"/>
+            <wp:effectExtent l="0" t="0" r="0" b="0"/>
+            <wp:wrapSquare wrapText="bothSides"/>
+            <wp:docPr id="424089451" name="Image 3"/>
+            <wp:cNvGraphicFramePr>
+              <a:graphicFrameLocks xmlns:a="http://schemas.openxmlformats.org/drawingml/2006/main" noChangeAspect="1"/>
+            </wp:cNvGraphicFramePr>
+            <a:graphic xmlns:a="http://schemas.openxmlformats.org/drawingml/2006/main">
+              <a:graphicData uri="http://schemas.openxmlformats.org/drawingml/2006/picture">
+                <pic:pic xmlns:pic="http://schemas.openxmlformats.org/drawingml/2006/picture">
+                  <pic:nvPicPr>
+                    <pic:cNvPr id="0" name="Picture 3"/>
+                    <pic:cNvPicPr>
+                      <a:picLocks noChangeAspect="1" noChangeArrowheads="1"/>
+                    </pic:cNvPicPr>
+                  </pic:nvPicPr>
+                  <pic:blipFill>
+                    <a:blip r:embed="rId5">
+                      <a:extLst>
+                        <a:ext uri="{28A0092B-C50C-407E-A947-70E740481C1C}">
+                          <a14:useLocalDpi xmlns:a14="http://schemas.microsoft.com/office/drawing/2010/main" val="0"/>
+                        </a:ext>
+                      </a:extLst>
+                    </a:blip>
+                    <a:srcRect/>
+                    <a:stretch>
+                      <a:fillRect/>
+                    </a:stretch>
+                  </pic:blipFill>
+                  <pic:spPr bwMode="auto">
+                    <a:xfrm>
+                      <a:off x="0" y="0"/>
+                      <a:ext cx="5680075" cy="6654165"/>
+                    </a:xfrm>
+                    <a:prstGeom prst="rect">
+                      <a:avLst/>
+                    </a:prstGeom>
+                    <a:noFill/>
+                    <a:ln>
+                      <a:noFill/>
+                    </a:ln>
+                  </pic:spPr>
+                </pic:pic>
+              </a:graphicData>
+            </a:graphic>
+            <wp14:sizeRelH relativeFrom="margin">
+              <wp14:pctWidth>0</wp14:pctWidth>
+            </wp14:sizeRelH>
+            <wp14:sizeRelV relativeFrom="margin">
+              <wp14:pctHeight>0</wp14:pctHeight>
+            </wp14:sizeRelV>
+          </wp:anchor>
+        </w:drawing>
+      </w:r>
+      <w:r>
+        <w:rPr>
+          <w:noProof/>
+        </w:rPr>
+        <mc:AlternateContent>
+          <mc:Choice Requires="wps">
+            <w:drawing>
+              <wp:anchor distT="0" distB="0" distL="114300" distR="114300" simplePos="0" relativeHeight="251660288" behindDoc="0" locked="0" layoutInCell="1" allowOverlap="1" wp14:anchorId="693E83C0" wp14:editId="02A8E956">
+                <wp:simplePos x="0" y="0"/>
+                <wp:positionH relativeFrom="margin">
+                  <wp:align>center</wp:align>
+                </wp:positionH>
+                <wp:positionV relativeFrom="paragraph">
+                  <wp:posOffset>7300595</wp:posOffset>
+                </wp:positionV>
+                <wp:extent cx="5680075" cy="635"/>
+                <wp:effectExtent l="0" t="0" r="0" b="0"/>
+                <wp:wrapSquare wrapText="bothSides"/>
+                <wp:docPr id="1867532010" name="Zone de texte 1"/>
+                <wp:cNvGraphicFramePr/>
+                <a:graphic xmlns:a="http://schemas.openxmlformats.org/drawingml/2006/main">
+                  <a:graphicData uri="http://schemas.microsoft.com/office/word/2010/wordprocessingShape">
+                    <wps:wsp>
+                      <wps:cNvSpPr txBox="1"/>
+                      <wps:spPr>
+                        <a:xfrm>
+                          <a:off x="0" y="0"/>
+                          <a:ext cx="5680075" cy="635"/>
+                        </a:xfrm>
+                        <a:prstGeom prst="rect">
+                          <a:avLst/>
+                        </a:prstGeom>
+                        <a:solidFill>
+                          <a:prstClr val="white"/>
+                        </a:solidFill>
+                        <a:ln>
+                          <a:noFill/>
+                        </a:ln>
+                      </wps:spPr>
+                      <wps:txbx>
+                        <w:txbxContent>
+                          <w:p>
+                            <w:pPr>
+                              <w:pStyle w:val="Lgende"/>
+                              <w:jc w:val="center"/>
+                              <w:rPr>
+                                <w:noProof/>
+                                <w:lang w:val="fr-FR"/>
+                              </w:rPr>
+                            </w:pPr>
+                            <w:r>
+                              <w:t xml:space="preserve">Figure </w:t>
+                            </w:r>
+                            <w:r>
+                              <w:fldChar w:fldCharType="begin"/>
+                            </w:r>
+                            <w:r>
+                              <w:instrText xml:space="preserve"> SEQ Figure \* ARABIC </w:instrText>
+                            </w:r>
+                            <w:r>
+                              <w:fldChar w:fldCharType="separate"/>
+                            </w:r>
+                            <w:r>
+                              <w:rPr>
+                                <w:noProof/>
+                              </w:rPr>
+                              <w:t>1</w:t>
+                            </w:r>
+                            <w:r>
+                              <w:fldChar w:fldCharType="end"/>
+                            </w:r>
+                            <w:r>
+                              <w:rPr>
+                                <w:lang w:val="fr-FR"/>
+                              </w:rPr>
+                              <w:t> : usecase diagram</w:t>
+                            </w:r>
+                          </w:p>
+                        </w:txbxContent>
+                      </wps:txbx>
+                      <wps:bodyPr rot="0" spcFirstLastPara="0" vertOverflow="overflow" horzOverflow="overflow" vert="horz" wrap="square" lIns="0" tIns="0" rIns="0" bIns="0" numCol="1" spcCol="0" rtlCol="0" fromWordArt="0" anchor="t" anchorCtr="0" forceAA="0" compatLnSpc="1">
+                        <a:prstTxWarp prst="textNoShape">
+                          <a:avLst/>
+                        </a:prstTxWarp>
+                        <a:spAutoFit/>
+                      </wps:bodyPr>
+                    </wps:wsp>
+                  </a:graphicData>
+                </a:graphic>
+              </wp:anchor>
+            </w:drawing>
+          </mc:Choice>
+          <mc:Fallback>
+            <w:pict>
+              <v:shapetype w14:anchorId="693E83C0" id="_x0000_t202" coordsize="21600,21600" o:spt="202" path="m,l,21600r21600,l21600,xe">
+                <v:stroke joinstyle="miter"/>
+                <v:path gradientshapeok="t" o:connecttype="rect"/>
+              </v:shapetype>
+              <v:shape id="Zone de texte 1" o:spid="_x0000_s1026" type="#_x0000_t202" style="position:absolute;left:0;text-align:left;margin-left:0;margin-top:574.85pt;width:447.25pt;height:.05pt;z-index:251660288;visibility:visible;mso-wrap-style:square;mso-wrap-distance-left:9pt;mso-wrap-distance-top:0;mso-wrap-distance-right:9pt;mso-wrap-distance-bottom:0;mso-position-horizontal:center;mso-position-horizontal-relative:margin;mso-position-vertical:absolute;mso-position-vertical-relative:text;v-text-anchor:top" o:gfxdata="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" stroked="f">
+                <v:textbox style="mso-fit-shape-to-text:t" inset="0,0,0,0">
+                  <w:txbxContent>
+                    <w:p>
+                      <w:pPr>
+                        <w:pStyle w:val="Lgende"/>
+                        <w:jc w:val="center"/>
+                        <w:rPr>
+                          <w:noProof/>
+                          <w:lang w:val="fr-FR"/>
+                        </w:rPr>
+                      </w:pPr>
+                      <w:r>
+                        <w:t xml:space="preserve">Figure </w:t>
+                      </w:r>
+                      <w:r>
+                        <w:fldChar w:fldCharType="begin"/>
+                      </w:r>
+                      <w:r>
+                        <w:instrText xml:space="preserve"> SEQ Figure \* ARABIC </w:instrText>
+                      </w:r>
+                      <w:r>
+                        <w:fldChar w:fldCharType="separate"/>
+                      </w:r>
+                      <w:r>
+                        <w:rPr>
+                          <w:noProof/>
+                        </w:rPr>
+                        <w:t>1</w:t>
+                      </w:r>
+                      <w:r>
+                        <w:fldChar w:fldCharType="end"/>
+                      </w:r>
+                      <w:r>
+                        <w:rPr>
+                          <w:lang w:val="fr-FR"/>
+                        </w:rPr>
+                        <w:t> : usecase diagram</w:t>
+                      </w:r>
+                    </w:p>
+                  </w:txbxContent>
+                </v:textbox>
+                <w10:wrap type="square" anchorx="margin"/>
+              </v:shape>
+            </w:pict>
+          </mc:Fallback>
+        </mc:AlternateContent>
+      </w:r>
+      <w:r>
+        <w:rPr>
+          <w:lang w:val="fr-CH"/>
+        </w:rPr>
+        <w:t>Nous avons identifié les fonctions</w:t>
+      </w:r>
+      <w:r>
+        <w:rPr>
+          <w:lang w:val="fr-CH"/>
+        </w:rPr>
+        <w:t xml:space="preserve"> présentes dans la Figure 1. Nous avons décidé de construire notre application avec une architecture client – serveur, car dans notre cas </w:t>
+      </w:r>
+      <w:r>
+        <w:rPr>
+          <w:lang w:val="fr-CH"/>
+        </w:rPr>
+        <w:lastRenderedPageBreak/>
+        <w:t>pour une architecture data – centered, il nous a semblé naturel que le blackboard central (qui stocke toutes les données) soit géré par un serveur qui se charge du « blackboard » et qui fournis aux acteurs (dans ce cas les joueurs) les fonctions qui permettent de lire et écrire sur le « blackboard ».</w:t>
+      </w:r>
+      <w:r>
+        <w:rPr>
+          <w:lang w:val="fr-CH"/>
+        </w:rPr>
+        <w:t xml:space="preserve"> </w:t>
+      </w:r>
+    </w:p>
+    <w:p>
+      <w:pPr>
+        <w:jc w:val="both"/>
+        <w:rPr>
+          <w:lang w:val="fr-CH"/>
+        </w:rPr>
+      </w:pPr>
+      <w:r>
+        <w:rPr>
+          <w:lang w:val="fr-CH"/>
+        </w:rPr>
+        <w:t xml:space="preserve">Ensuite les diagrammes que nous avons définis avant de passer à la phase de conception sont le Data Flow Diagram et le diagramme de requirements. Nous avons décidé que ces diagrammes étaient les plus pertinents à établir à l’avance tandis que le reste des diagrammes </w:t>
+      </w:r>
+      <w:r>
+        <w:rPr>
+          <w:lang w:val="fr-CH"/>
+        </w:rPr>
+        <w:t>peuvent</w:t>
+      </w:r>
+      <w:r>
+        <w:rPr>
+          <w:lang w:val="fr-CH"/>
+        </w:rPr>
+        <w:t xml:space="preserve"> changer au cours du développement de l’application.</w:t>
+      </w:r>
+      <w:r>
+        <w:rPr>
+          <w:lang w:val="fr-CH"/>
+        </w:rPr>
+        <w:t xml:space="preserve"> </w:t>
+      </w:r>
+    </w:p>
+    <w:p>
+      <w:pPr>
+        <w:jc w:val="both"/>
+        <w:rPr>
+          <w:lang w:val="fr-CH"/>
+        </w:rPr>
+      </w:pPr>
+      <w:r>
+        <w:rPr>
+          <w:lang w:val="fr-CH"/>
+        </w:rPr>
+        <w:t>Pour le Data Flow Diagram</w:t>
+      </w:r>
+      <w:r>
+        <w:rPr>
+          <w:lang w:val="fr-CH"/>
+        </w:rPr>
+        <w:t xml:space="preserve"> (figure 2)</w:t>
+      </w:r>
+      <w:r>
+        <w:rPr>
+          <w:lang w:val="fr-CH"/>
+        </w:rPr>
+        <w:t>, étant donné l’architecture data centered, nous n’avons défini qu’un seul Data Store pour mettre l’importance sur le modèle « blackboard » où toutes les données sont stockées à un endroit central.</w:t>
+      </w:r>
+    </w:p>
+    <w:p>
+      <w:pPr>
+        <w:keepNext/>
+        <w:jc w:val="both"/>
+      </w:pPr>
+      <w:r>
+        <w:rPr>
+          <w:noProof/>
+          <w:lang w:val="fr-CH"/>
+        </w:rPr>
+        <w:t xml:space="preserve"> </w:t>
+      </w:r>
+      <w:r>
+        <w:rPr>
+          <w:noProof/>
+          <w:lang w:val="fr-CH"/>
+        </w:rPr>
+        <w:drawing>
+          <wp:inline distT="0" distB="0" distL="0" distR="0" wp14:anchorId="2E4F7909" wp14:editId="39E31F45">
+            <wp:extent cx="5724525" cy="3714750"/>
+            <wp:effectExtent l="0" t="0" r="9525" b="0"/>
+            <wp:docPr id="1734696409" name="Image 4"/>
+            <wp:cNvGraphicFramePr>
+              <a:graphicFrameLocks xmlns:a="http://schemas.openxmlformats.org/drawingml/2006/main" noChangeAspect="1"/>
+            </wp:cNvGraphicFramePr>
+            <a:graphic xmlns:a="http://schemas.openxmlformats.org/drawingml/2006/main">
+              <a:graphicData uri="http://schemas.openxmlformats.org/drawingml/2006/picture">
+                <pic:pic xmlns:pic="http://schemas.openxmlformats.org/drawingml/2006/picture">
+                  <pic:nvPicPr>
+                    <pic:cNvPr id="0" name="Picture 4"/>
+                    <pic:cNvPicPr>
+                      <a:picLocks noChangeAspect="1" noChangeArrowheads="1"/>
+                    </pic:cNvPicPr>
+                  </pic:nvPicPr>
+                  <pic:blipFill>
+                    <a:blip r:embed="rId6">
+                      <a:extLst>
+                        <a:ext uri="{28A0092B-C50C-407E-A947-70E740481C1C}">
+                          <a14:useLocalDpi xmlns:a14="http://schemas.microsoft.com/office/drawing/2010/main" val="0"/>
+                        </a:ext>
+                      </a:extLst>
+                    </a:blip>
+                    <a:srcRect/>
+                    <a:stretch>
+                      <a:fillRect/>
+                    </a:stretch>
+                  </pic:blipFill>
+                  <pic:spPr bwMode="auto">
+                    <a:xfrm>
+                      <a:off x="0" y="0"/>
+                      <a:ext cx="5724525" cy="3714750"/>
+                    </a:xfrm>
+                    <a:prstGeom prst="rect">
+                      <a:avLst/>
+                    </a:prstGeom>
+                    <a:noFill/>
+                    <a:ln>
+                      <a:noFill/>
+                    </a:ln>
+                  </pic:spPr>
+                </pic:pic>
+              </a:graphicData>
+            </a:graphic>
+          </wp:inline>
+        </w:drawing>
+      </w:r>
+    </w:p>
+    <w:p>
+      <w:pPr>
+        <w:pStyle w:val="Lgende"/>
+        <w:jc w:val="center"/>
+        <w:rPr>
+          <w:lang w:val="fr-FR"/>
+        </w:rPr>
+      </w:pPr>
+      <w:r>
+        <w:t xml:space="preserve">Figure </w:t>
+      </w:r>
+      <w:r>
+        <w:fldChar w:fldCharType="begin"/>
+      </w:r>
+      <w:r>
+        <w:instrText xml:space="preserve"> SEQ Figure \* ARABIC </w:instrText>
+      </w:r>
+      <w:r>
+        <w:fldChar w:fldCharType="separate"/>
+      </w:r>
+      <w:r>
+        <w:rPr>
+          <w:noProof/>
+        </w:rPr>
+        <w:t>2</w:t>
+      </w:r>
+      <w:r>
+        <w:fldChar w:fldCharType="end"/>
+      </w:r>
+      <w:r>
+        <w:rPr>
+          <w:lang w:val="fr-FR"/>
+        </w:rPr>
+        <w:t xml:space="preserve"> : DFD</w:t>
+      </w:r>
+    </w:p>
+    <w:p>
+      <w:pPr>
+        <w:jc w:val="both"/>
+        <w:rPr>
+          <w:lang w:val="fr-CH"/>
+        </w:rPr>
+      </w:pPr>
+      <w:r>
+        <w:rPr>
+          <w:lang w:val="fr-FR"/>
+        </w:rPr>
+        <w:t>Dans le requirements diagram (figure 3), nous soulignons les exigences que nous avons identifiées pour notre application</w:t>
+      </w:r>
+      <w:r>
+        <w:rPr>
+          <w:lang w:val="fr-FR"/>
+        </w:rPr>
+        <w:t>.</w:t>
+      </w:r>
+      <w:r>
+        <w:rPr>
+          <w:lang w:val="fr-FR"/>
+        </w:rPr>
+        <w:t xml:space="preserve"> Une fois ces trois diagrammes finalisés, nous avons commencé la phase d’implémentation. Selon nous, ces trois diagrammes nous donnent les détails les plus important sur l’architecture. Le reste des diagrammes ont été établis au cours du projet.</w:t>
+      </w:r>
+    </w:p>
+    <w:p>
+      <w:pPr>
+        <w:jc w:val="both"/>
+        <w:rPr>
+          <w:lang w:val="fr-CH"/>
+        </w:rPr>
+      </w:pPr>
+      <w:r>
+        <w:rPr>
+          <w:noProof/>
+        </w:rPr>
+        <w:lastRenderedPageBreak/>
+        <mc:AlternateContent>
+          <mc:Choice Requires="wps">
+            <w:drawing>
+              <wp:anchor distT="0" distB="0" distL="114300" distR="114300" simplePos="0" relativeHeight="251663360" behindDoc="0" locked="0" layoutInCell="1" allowOverlap="1" wp14:anchorId="717FF5D0" wp14:editId="2D6EABBC">
+                <wp:simplePos x="0" y="0"/>
+                <wp:positionH relativeFrom="column">
+                  <wp:posOffset>-896620</wp:posOffset>
+                </wp:positionH>
+                <wp:positionV relativeFrom="paragraph">
+                  <wp:posOffset>5143500</wp:posOffset>
+                </wp:positionV>
+                <wp:extent cx="7523480" cy="635"/>
+                <wp:effectExtent l="0" t="0" r="0" b="0"/>
+                <wp:wrapSquare wrapText="bothSides"/>
+                <wp:docPr id="954503826" name="Zone de texte 1"/>
+                <wp:cNvGraphicFramePr/>
+                <a:graphic xmlns:a="http://schemas.openxmlformats.org/drawingml/2006/main">
+                  <a:graphicData uri="http://schemas.microsoft.com/office/word/2010/wordprocessingShape">
+                    <wps:wsp>
+                      <wps:cNvSpPr txBox="1"/>
+                      <wps:spPr>
+                        <a:xfrm>
+                          <a:off x="0" y="0"/>
+                          <a:ext cx="7523480" cy="635"/>
+                        </a:xfrm>
+                        <a:prstGeom prst="rect">
+                          <a:avLst/>
+                        </a:prstGeom>
+                        <a:solidFill>
+                          <a:prstClr val="white"/>
+                        </a:solidFill>
+                        <a:ln>
+                          <a:noFill/>
+                        </a:ln>
+                      </wps:spPr>
+                      <wps:txbx>
+                        <w:txbxContent>
+                          <w:p>
+                            <w:pPr>
+                              <w:pStyle w:val="Lgende"/>
+                              <w:jc w:val="center"/>
+                              <w:rPr>
+                                <w:noProof/>
+                              </w:rPr>
+                            </w:pPr>
+                            <w:r>
+                              <w:t xml:space="preserve">Figure </w:t>
+                            </w:r>
+                            <w:r>
+                              <w:fldChar w:fldCharType="begin"/>
+                            </w:r>
+                            <w:r>
+                              <w:instrText xml:space="preserve"> SEQ Figure \* ARABIC </w:instrText>
+                            </w:r>
+                            <w:r>
+                              <w:fldChar w:fldCharType="separate"/>
+                            </w:r>
+                            <w:r>
+                              <w:rPr>
+                                <w:noProof/>
+                              </w:rPr>
+                              <w:t>3</w:t>
+                            </w:r>
+                            <w:r>
+                              <w:fldChar w:fldCharType="end"/>
+                            </w:r>
+                            <w:r>
+                              <w:rPr>
+                                <w:lang w:val="fr-FR"/>
+                              </w:rPr>
+                              <w:t xml:space="preserve"> : requirements diagram</w:t>
+                            </w:r>
+                          </w:p>
+                        </w:txbxContent>
+                      </wps:txbx>
+                      <wps:bodyPr rot="0" spcFirstLastPara="0" vertOverflow="overflow" horzOverflow="overflow" vert="horz" wrap="square" lIns="0" tIns="0" rIns="0" bIns="0" numCol="1" spcCol="0" rtlCol="0" fromWordArt="0" anchor="t" anchorCtr="0" forceAA="0" compatLnSpc="1">
+                        <a:prstTxWarp prst="textNoShape">
+                          <a:avLst/>
+                        </a:prstTxWarp>
+                        <a:spAutoFit/>
+                      </wps:bodyPr>
+                    </wps:wsp>
+                  </a:graphicData>
+                </a:graphic>
+              </wp:anchor>
+            </w:drawing>
+          </mc:Choice>
+          <mc:Fallback>
+            <w:pict>
+              <v:shape w14:anchorId="717FF5D0" id="_x0000_s1027" type="#_x0000_t202" style="position:absolute;left:0;text-align:left;margin-left:-70.6pt;margin-top:405pt;width:592.4pt;height:.05pt;z-index:251663360;visibility:visible;mso-wrap-style:square;mso-wrap-distance-left:9pt;mso-wrap-distance-top:0;mso-wrap-distance-right:9pt;mso-wrap-distance-bottom:0;mso-position-horizontal:absolute;mso-position-horizontal-relative:text;mso-position-vertical:absolute;mso-position-vertical-relative:text;v-text-anchor:top" o:gfxdata="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" stroked="f">
+                <v:textbox style="mso-fit-shape-to-text:t" inset="0,0,0,0">
+                  <w:txbxContent>
+                    <w:p>
+                      <w:pPr>
+                        <w:pStyle w:val="Lgende"/>
+                        <w:jc w:val="center"/>
+                        <w:rPr>
+                          <w:noProof/>
+                        </w:rPr>
+                      </w:pPr>
+                      <w:r>
+                        <w:t xml:space="preserve">Figure </w:t>
+                      </w:r>
+                      <w:r>
+                        <w:fldChar w:fldCharType="begin"/>
+                      </w:r>
+                      <w:r>
+                        <w:instrText xml:space="preserve"> SEQ Figure \* ARABIC </w:instrText>
+                      </w:r>
+                      <w:r>
+                        <w:fldChar w:fldCharType="separate"/>
+                      </w:r>
+                      <w:r>
+                        <w:rPr>
+                          <w:noProof/>
+                        </w:rPr>
+                        <w:t>3</w:t>
+                      </w:r>
+                      <w:r>
+                        <w:fldChar w:fldCharType="end"/>
+                      </w:r>
+                      <w:r>
+                        <w:rPr>
+                          <w:lang w:val="fr-FR"/>
+                        </w:rPr>
+                        <w:t xml:space="preserve"> : requirements diagram</w:t>
+                      </w:r>
+                    </w:p>
+                  </w:txbxContent>
+                </v:textbox>
+                <w10:wrap type="square"/>
+              </v:shape>
+            </w:pict>
+          </mc:Fallback>
+        </mc:AlternateContent>
+      </w:r>
+      <w:r>
+        <w:rPr>
+          <w:noProof/>
+          <w:lang w:val="fr-CH"/>
+        </w:rPr>
+        <w:drawing>
+          <wp:anchor distT="0" distB="0" distL="114300" distR="114300" simplePos="0" relativeHeight="251661312" behindDoc="0" locked="0" layoutInCell="1" allowOverlap="1" wp14:anchorId="0093EFC9" wp14:editId="5E097A95">
+            <wp:simplePos x="0" y="0"/>
+            <wp:positionH relativeFrom="margin">
+              <wp:align>center</wp:align>
+            </wp:positionH>
+            <wp:positionV relativeFrom="margin">
+              <wp:align>top</wp:align>
+            </wp:positionV>
+            <wp:extent cx="7523480" cy="5086350"/>
+            <wp:effectExtent l="0" t="0" r="1270" b="0"/>
+            <wp:wrapSquare wrapText="bothSides"/>
+            <wp:docPr id="827518404" name="Image 5"/>
+            <wp:cNvGraphicFramePr>
+              <a:graphicFrameLocks xmlns:a="http://schemas.openxmlformats.org/drawingml/2006/main" noChangeAspect="1"/>
+            </wp:cNvGraphicFramePr>
+            <a:graphic xmlns:a="http://schemas.openxmlformats.org/drawingml/2006/main">
+              <a:graphicData uri="http://schemas.openxmlformats.org/drawingml/2006/picture">
+                <pic:pic xmlns:pic="http://schemas.openxmlformats.org/drawingml/2006/picture">
+                  <pic:nvPicPr>
+                    <pic:cNvPr id="0" name="Picture 5"/>
+                    <pic:cNvPicPr>
+                      <a:picLocks noChangeAspect="1" noChangeArrowheads="1"/>
+                    </pic:cNvPicPr>
+                  </pic:nvPicPr>
+                  <pic:blipFill>
+                    <a:blip r:embed="rId7" cstate="print">
+                      <a:extLst>
+                        <a:ext uri="{28A0092B-C50C-407E-A947-70E740481C1C}">
+                          <a14:useLocalDpi xmlns:a14="http://schemas.microsoft.com/office/drawing/2010/main" val="0"/>
+                        </a:ext>
+                      </a:extLst>
+                    </a:blip>
+                    <a:srcRect/>
+                    <a:stretch>
+                      <a:fillRect/>
+                    </a:stretch>
+                  </pic:blipFill>
+                  <pic:spPr bwMode="auto">
+                    <a:xfrm>
+                      <a:off x="0" y="0"/>
+                      <a:ext cx="7523480" cy="5086350"/>
+                    </a:xfrm>
+                    <a:prstGeom prst="rect">
+                      <a:avLst/>
+                    </a:prstGeom>
+                    <a:noFill/>
+                    <a:ln>
+                      <a:noFill/>
+                    </a:ln>
+                  </pic:spPr>
+                </pic:pic>
+              </a:graphicData>
+            </a:graphic>
+            <wp14:sizeRelH relativeFrom="margin">
+              <wp14:pctWidth>0</wp14:pctWidth>
+            </wp14:sizeRelH>
+            <wp14:sizeRelV relativeFrom="margin">
+              <wp14:pctHeight>0</wp14:pctHeight>
+            </wp14:sizeRelV>
+          </wp:anchor>
+        </w:drawing>
+      </w:r>
+    </w:p>
+    <w:p>
+      <w:pPr>
+        <w:jc w:val="both"/>
+        <w:rPr>
+          <w:lang w:val="fr-CH"/>
+        </w:rPr>
+      </w:pPr>
+      <w:r>
+        <w:rPr>
+          <w:lang w:val="fr-CH"/>
+        </w:rPr>
+        <w:t>Pour le diagramme de composants</w:t>
+      </w:r>
+      <w:r>
+        <w:rPr>
+          <w:lang w:val="fr-CH"/>
+        </w:rPr>
+        <w:t xml:space="preserve"> (figure 4)</w:t>
+      </w:r>
+      <w:r>
+        <w:rPr>
+          <w:lang w:val="fr-CH"/>
+        </w:rPr>
+        <w:t xml:space="preserve">, </w:t>
+      </w:r>
+      <w:r>
+        <w:rPr>
+          <w:lang w:val="fr-CH"/>
+        </w:rPr>
+        <w:t>nous avons une structure simple. Le client ne se charge que d’afficher les données reçues par le serveur et d’envoyer les actions que l’utilisateur souhaite exécuter. Du côté serveur, on modélise le blackboard par un composant « Game State » qui contient la liste des joueurs avec l’argent qu’ils ont à leur disposition pour faire des paris et la liste des paris en cours.</w:t>
+      </w:r>
+    </w:p>
+    <w:p>
+      <w:pPr>
+        <w:keepNext/>
+        <w:jc w:val="both"/>
+      </w:pPr>
+      <w:r>
+        <w:rPr>
+          <w:noProof/>
+          <w:lang w:val="fr-CH"/>
+        </w:rPr>
+        <w:lastRenderedPageBreak/>
+        <w:drawing>
+          <wp:inline distT="0" distB="0" distL="0" distR="0" wp14:anchorId="25632528" wp14:editId="394B893D">
+            <wp:extent cx="5728970" cy="2397125"/>
+            <wp:effectExtent l="0" t="0" r="5080" b="3175"/>
+            <wp:docPr id="1176325499" name="Image 11"/>
+            <wp:cNvGraphicFramePr>
+              <a:graphicFrameLocks xmlns:a="http://schemas.openxmlformats.org/drawingml/2006/main" noChangeAspect="1"/>
+            </wp:cNvGraphicFramePr>
+            <a:graphic xmlns:a="http://schemas.openxmlformats.org/drawingml/2006/main">
+              <a:graphicData uri="http://schemas.openxmlformats.org/drawingml/2006/picture">
+                <pic:pic xmlns:pic="http://schemas.openxmlformats.org/drawingml/2006/picture">
+                  <pic:nvPicPr>
+                    <pic:cNvPr id="0" name="Picture 11"/>
+                    <pic:cNvPicPr>
+                      <a:picLocks noChangeAspect="1" noChangeArrowheads="1"/>
+                    </pic:cNvPicPr>
+                  </pic:nvPicPr>
+                  <pic:blipFill>
+                    <a:blip r:embed="rId8">
+                      <a:extLst>
+                        <a:ext uri="{28A0092B-C50C-407E-A947-70E740481C1C}">
+                          <a14:useLocalDpi xmlns:a14="http://schemas.microsoft.com/office/drawing/2010/main" val="0"/>
+                        </a:ext>
+                      </a:extLst>
+                    </a:blip>
+                    <a:srcRect/>
+                    <a:stretch>
+                      <a:fillRect/>
+                    </a:stretch>
+                  </pic:blipFill>
+                  <pic:spPr bwMode="auto">
+                    <a:xfrm>
+                      <a:off x="0" y="0"/>
+                      <a:ext cx="5728970" cy="2397125"/>
+                    </a:xfrm>
+                    <a:prstGeom prst="rect">
+                      <a:avLst/>
+                    </a:prstGeom>
+                    <a:noFill/>
+                    <a:ln>
+                      <a:noFill/>
+                    </a:ln>
+                  </pic:spPr>
+                </pic:pic>
+              </a:graphicData>
+            </a:graphic>
+          </wp:inline>
+        </w:drawing>
+      </w:r>
+    </w:p>
+    <w:p>
+      <w:pPr>
+        <w:pStyle w:val="Lgende"/>
+        <w:jc w:val="both"/>
+        <w:rPr>
+          <w:lang w:val="fr-CH"/>
+        </w:rPr>
+      </w:pPr>
+      <w:r>
+        <w:t xml:space="preserve">Figure </w:t>
+      </w:r>
+      <w:r>
+        <w:fldChar w:fldCharType="begin"/>
+      </w:r>
+      <w:r>
+        <w:instrText xml:space="preserve"> SEQ Figure \* ARABIC </w:instrText>
+      </w:r>
+      <w:r>
+        <w:fldChar w:fldCharType="separate"/>
+      </w:r>
+      <w:r>
+        <w:rPr>
+          <w:noProof/>
+        </w:rPr>
+        <w:t>4</w:t>
+      </w:r>
+      <w:r>
+        <w:fldChar w:fldCharType="end"/>
+      </w:r>
+      <w:r>
+        <w:rPr>
+          <w:lang w:val="fr-FR"/>
+        </w:rPr>
+        <w:t xml:space="preserve"> : component diagram</w:t>
+      </w:r>
+    </w:p>
+    <w:p>
+      <w:pPr>
+        <w:jc w:val="both"/>
+        <w:rPr>
+          <w:lang w:val="fr-CH"/>
+        </w:rPr>
+      </w:pPr>
+      <w:r>
+        <w:rPr>
+          <w:lang w:val="fr-CH"/>
+        </w:rPr>
+        <w:t>Dans le diagramme de blocs</w:t>
+      </w:r>
+      <w:r>
+        <w:rPr>
+          <w:lang w:val="fr-CH"/>
+        </w:rPr>
+        <w:t xml:space="preserve"> (Figure 5)</w:t>
+      </w:r>
+      <w:r>
+        <w:rPr>
+          <w:lang w:val="fr-CH"/>
+        </w:rPr>
+        <w:t>, on définit plus précisément les parties de l’implémentations.</w:t>
+      </w:r>
+      <w:r>
+        <w:rPr>
+          <w:lang w:val="fr-CH"/>
+        </w:rPr>
+        <w:t xml:space="preserve"> Pour ne pas trop encombrer le diagramme, tous les attributs ne sont pas indiqués (par exemple pour le client, il doit garder les informations sur le game state pour afficher l’interface). Nous avons aussi omis le composant Game Logic du diagramme de blocs car dans l’implémentation</w:t>
+      </w:r>
+      <w:r>
+        <w:rPr>
+          <w:lang w:val="fr-CH"/>
+        </w:rPr>
+        <w:t xml:space="preserve"> la logique du jeu sera</w:t>
+      </w:r>
+      <w:r>
+        <w:rPr>
+          <w:lang w:val="fr-CH"/>
+        </w:rPr>
+        <w:t xml:space="preserve"> implémentée par</w:t>
+      </w:r>
+      <w:r>
+        <w:rPr>
+          <w:lang w:val="fr-CH"/>
+        </w:rPr>
+        <w:t xml:space="preserve"> des fonctions du Game State et non pas un bloc séparé</w:t>
+      </w:r>
+      <w:r>
+        <w:rPr>
+          <w:lang w:val="fr-CH"/>
+        </w:rPr>
+        <w:t xml:space="preserve"> agissant sur le Game State</w:t>
+      </w:r>
+      <w:r>
+        <w:rPr>
+          <w:lang w:val="fr-CH"/>
+        </w:rPr>
+        <w:t>.</w:t>
+      </w:r>
+    </w:p>
+    <w:p>
+      <w:pPr>
+        <w:keepNext/>
+        <w:jc w:val="both"/>
+      </w:pPr>
+      <w:r>
+        <w:rPr>
+          <w:noProof/>
+          <w:lang w:val="fr-CH"/>
+        </w:rPr>
+        <w:drawing>
+          <wp:inline distT="0" distB="0" distL="0" distR="0" wp14:anchorId="34FB243F" wp14:editId="21AA5117">
+            <wp:extent cx="4191000" cy="3304210"/>
+            <wp:effectExtent l="0" t="0" r="0" b="0"/>
+            <wp:docPr id="282961963" name="Image 13"/>
+            <wp:cNvGraphicFramePr>
+              <a:graphicFrameLocks xmlns:a="http://schemas.openxmlformats.org/drawingml/2006/main" noChangeAspect="1"/>
+            </wp:cNvGraphicFramePr>
+            <a:graphic xmlns:a="http://schemas.openxmlformats.org/drawingml/2006/main">
+              <a:graphicData uri="http://schemas.openxmlformats.org/drawingml/2006/picture">
+                <pic:pic xmlns:pic="http://schemas.openxmlformats.org/drawingml/2006/picture">
+                  <pic:nvPicPr>
+                    <pic:cNvPr id="0" name="Picture 13"/>
+                    <pic:cNvPicPr>
+                      <a:picLocks noChangeAspect="1" noChangeArrowheads="1"/>
+                    </pic:cNvPicPr>
+                  </pic:nvPicPr>
+                  <pic:blipFill>
+                    <a:blip r:embed="rId9">
+                      <a:extLst>
+                        <a:ext uri="{28A0092B-C50C-407E-A947-70E740481C1C}">
+                          <a14:useLocalDpi xmlns:a14="http://schemas.microsoft.com/office/drawing/2010/main" val="0"/>
+                        </a:ext>
+                      </a:extLst>
+                    </a:blip>
+                    <a:srcRect/>
+                    <a:stretch>
+                      <a:fillRect/>
+                    </a:stretch>
+                  </pic:blipFill>
+                  <pic:spPr bwMode="auto">
+                    <a:xfrm>
+                      <a:off x="0" y="0"/>
+                      <a:ext cx="4202362" cy="3313168"/>
+                    </a:xfrm>
+                    <a:prstGeom prst="rect">
+                      <a:avLst/>
+                    </a:prstGeom>
+                    <a:noFill/>
+                    <a:ln>
+                      <a:noFill/>
+                    </a:ln>
+                  </pic:spPr>
+                </pic:pic>
+              </a:graphicData>
+            </a:graphic>
+          </wp:inline>
+        </w:drawing>
+      </w:r>
+    </w:p>
+    <w:p>
+      <w:pPr>
+        <w:pStyle w:val="Lgende"/>
+        <w:jc w:val="both"/>
+        <w:rPr>
+          <w:lang w:val="fr-CH"/>
+        </w:rPr>
+      </w:pPr>
+      <w:r>
+        <w:t xml:space="preserve">Figure </w:t>
+      </w:r>
+      <w:r>
+        <w:fldChar w:fldCharType="begin"/>
+      </w:r>
+      <w:r>
+        <w:instrText xml:space="preserve"> SEQ Figure \* ARABIC </w:instrText>
+      </w:r>
+      <w:r>
+        <w:fldChar w:fldCharType="separate"/>
+      </w:r>
+      <w:r>
+        <w:rPr>
+          <w:noProof/>
+        </w:rPr>
+        <w:t>5</w:t>
+      </w:r>
+      <w:r>
+        <w:fldChar w:fldCharType="end"/>
+      </w:r>
+    </w:p>
+    <w:p>
+      <w:pPr>
+        <w:rPr>
+          <w:lang w:val="fr-CH"/>
+        </w:rPr>
+      </w:pPr>
+      <w:r>
+        <w:rPr>
+          <w:lang w:val="fr-CH"/>
+        </w:rPr>
+        <w:t>Finalement</w:t>
+      </w:r>
+      <w:r>
+        <w:rPr>
+          <w:lang w:val="fr-CH"/>
+        </w:rPr>
+        <w:t xml:space="preserve"> le diagramme de déploiement</w:t>
+      </w:r>
+      <w:r>
+        <w:rPr>
+          <w:lang w:val="fr-CH"/>
+        </w:rPr>
+        <w:t xml:space="preserve"> (Figure 6)</w:t>
+      </w:r>
+      <w:r>
+        <w:rPr>
+          <w:lang w:val="fr-CH"/>
+        </w:rPr>
+        <w:t xml:space="preserve"> a été fait à la fin par rapport à l’état final de l’application. Nous </w:t>
+      </w:r>
+      <w:r>
+        <w:rPr>
+          <w:lang w:val="fr-CH"/>
+        </w:rPr>
+        <w:t xml:space="preserve">n’avons pas ressenti qu’il était nécessaire de l’établir pour </w:t>
+      </w:r>
+      <w:r>
+        <w:rPr>
+          <w:lang w:val="fr-CH"/>
+        </w:rPr>
+        <w:lastRenderedPageBreak/>
+        <w:t>pouvoir implément</w:t>
+      </w:r>
+      <w:r>
+        <w:rPr>
+          <w:lang w:val="fr-CH"/>
+        </w:rPr>
+        <w:t>er</w:t>
+      </w:r>
+      <w:r>
+        <w:rPr>
+          <w:lang w:val="fr-CH"/>
+        </w:rPr>
+        <w:t xml:space="preserve"> l’application</w:t>
+      </w:r>
+      <w:r>
+        <w:rPr>
+          <w:lang w:val="fr-CH"/>
+        </w:rPr>
+        <w:t>, nous ne l’avons donc fait qu’en dernier.</w:t>
+      </w:r>
+      <w:r>
+        <w:rPr>
+          <w:noProof/>
+          <w:lang w:val="fr-CH"/>
+        </w:rPr>
+        <w:drawing>
+          <wp:inline distT="0" distB="0" distL="0" distR="0" wp14:anchorId="1DE97CC2" wp14:editId="22C7A99F">
+            <wp:extent cx="5728970" cy="2237740"/>
+            <wp:effectExtent l="0" t="0" r="5080" b="0"/>
+            <wp:docPr id="665879813" name="Image 14"/>
+            <wp:cNvGraphicFramePr>
+              <a:graphicFrameLocks xmlns:a="http://schemas.openxmlformats.org/drawingml/2006/main" noChangeAspect="1"/>
+            </wp:cNvGraphicFramePr>
+            <a:graphic xmlns:a="http://schemas.openxmlformats.org/drawingml/2006/main">
+              <a:graphicData uri="http://schemas.openxmlformats.org/drawingml/2006/picture">
+                <pic:pic xmlns:pic="http://schemas.openxmlformats.org/drawingml/2006/picture">
+                  <pic:nvPicPr>
+                    <pic:cNvPr id="0" name="Picture 14"/>
+                    <pic:cNvPicPr>
+                      <a:picLocks noChangeAspect="1" noChangeArrowheads="1"/>
+                    </pic:cNvPicPr>
+                  </pic:nvPicPr>
+                  <pic:blipFill>
+                    <a:blip r:embed="rId10">
+                      <a:extLst>
+                        <a:ext uri="{28A0092B-C50C-407E-A947-70E740481C1C}">
+                          <a14:useLocalDpi xmlns:a14="http://schemas.microsoft.com/office/drawing/2010/main" val="0"/>
+                        </a:ext>
+                      </a:extLst>
+                    </a:blip>
+                    <a:srcRect/>
+                    <a:stretch>
+                      <a:fillRect/>
+                    </a:stretch>
+                  </pic:blipFill>
+                  <pic:spPr bwMode="auto">
+                    <a:xfrm>
+                      <a:off x="0" y="0"/>
+                      <a:ext cx="5728970" cy="2237740"/>
+                    </a:xfrm>
+                    <a:prstGeom prst="rect">
+                      <a:avLst/>
+                    </a:prstGeom>
+                    <a:noFill/>
+                    <a:ln>
+                      <a:noFill/>
+                    </a:ln>
+                  </pic:spPr>
+                </pic:pic>
+              </a:graphicData>
+            </a:graphic>
+          </wp:inline>
+        </w:drawing>
+      </w:r>
+    </w:p>
+    <w:p>
+      <w:pPr>
+        <w:rPr>
+          <w:lang w:val="fr-CH"/>
+        </w:rPr>
+      </w:pPr>
     </w:p>
     <w:sectPr>
       <w:pgSz w:w="11906" w:h="16838"/>
@@ -481,7 +1625,7 @@
         <w:kern w:val="2"/>
         <w:sz w:val="24"/>
         <w:szCs w:val="24"/>
-        <w:lang w:val="en-CH" w:eastAsia="en-US" w:bidi="ar-SA"/>
+        <w:lang w:eastAsia="en-US" w:bidi="ar-SA"/>
         <w14:ligatures w14:val="standardContextual"/>
       </w:rPr>
     </w:rPrDefault>
@@ -872,13 +2016,13 @@
   <w:style w:type="paragraph" w:default="1" w:styleId="Normal">
     <w:name w:val="Normal"/>
     <w:qFormat/>
-    <w:rsid w:val="00341C88"/>
-  </w:style>
-  <w:style w:type="paragraph" w:styleId="Heading1">
+    <w:rsid w:val="00B51C5D"/>
+  </w:style>
+  <w:style w:type="paragraph" w:styleId="Titre1">
     <w:name w:val="heading 1"/>
     <w:basedOn w:val="Normal"/>
     <w:next w:val="Normal"/>
-    <w:link w:val="Heading1Char"/>
+    <w:link w:val="Titre1Car"/>
     <w:uiPriority w:val="9"/>
     <w:qFormat/>
     <w:rsid w:val="00DD2825"/>
@@ -895,11 +2039,11 @@
       <w:szCs w:val="40"/>
     </w:rPr>
   </w:style>
-  <w:style w:type="paragraph" w:styleId="Heading2">
+  <w:style w:type="paragraph" w:styleId="Titre2">
     <w:name w:val="heading 2"/>
     <w:basedOn w:val="Normal"/>
     <w:next w:val="Normal"/>
-    <w:link w:val="Heading2Char"/>
+    <w:link w:val="Titre2Car"/>
     <w:uiPriority w:val="9"/>
     <w:semiHidden/>
     <w:unhideWhenUsed/>
@@ -918,11 +2062,11 @@
       <w:szCs w:val="32"/>
     </w:rPr>
   </w:style>
-  <w:style w:type="paragraph" w:styleId="Heading3">
+  <w:style w:type="paragraph" w:styleId="Titre3">
     <w:name w:val="heading 3"/>
     <w:basedOn w:val="Normal"/>
     <w:next w:val="Normal"/>
-    <w:link w:val="Heading3Char"/>
+    <w:link w:val="Titre3Car"/>
     <w:uiPriority w:val="9"/>
     <w:semiHidden/>
     <w:unhideWhenUsed/>
@@ -941,11 +2085,11 @@
       <w:szCs w:val="28"/>
     </w:rPr>
   </w:style>
-  <w:style w:type="paragraph" w:styleId="Heading4">
+  <w:style w:type="paragraph" w:styleId="Titre4">
     <w:name w:val="heading 4"/>
     <w:basedOn w:val="Normal"/>
     <w:next w:val="Normal"/>
-    <w:link w:val="Heading4Char"/>
+    <w:link w:val="Titre4Car"/>
     <w:uiPriority w:val="9"/>
     <w:semiHidden/>
     <w:unhideWhenUsed/>
@@ -964,11 +2108,11 @@
       <w:color w:val="0F4761" w:themeColor="accent1" w:themeShade="BF"/>
     </w:rPr>
   </w:style>
-  <w:style w:type="paragraph" w:styleId="Heading5">
+  <w:style w:type="paragraph" w:styleId="Titre5">
     <w:name w:val="heading 5"/>
     <w:basedOn w:val="Normal"/>
     <w:next w:val="Normal"/>
-    <w:link w:val="Heading5Char"/>
+    <w:link w:val="Titre5Car"/>
     <w:uiPriority w:val="9"/>
     <w:semiHidden/>
     <w:unhideWhenUsed/>
@@ -985,11 +2129,11 @@
       <w:color w:val="0F4761" w:themeColor="accent1" w:themeShade="BF"/>
     </w:rPr>
   </w:style>
-  <w:style w:type="paragraph" w:styleId="Heading6">
+  <w:style w:type="paragraph" w:styleId="Titre6">
     <w:name w:val="heading 6"/>
     <w:basedOn w:val="Normal"/>
     <w:next w:val="Normal"/>
-    <w:link w:val="Heading6Char"/>
+    <w:link w:val="Titre6Car"/>
     <w:uiPriority w:val="9"/>
     <w:semiHidden/>
     <w:unhideWhenUsed/>
@@ -1008,11 +2152,11 @@
       <w:color w:val="595959" w:themeColor="text1" w:themeTint="A6"/>
     </w:rPr>
   </w:style>
-  <w:style w:type="paragraph" w:styleId="Heading7">
+  <w:style w:type="paragraph" w:styleId="Titre7">
     <w:name w:val="heading 7"/>
     <w:basedOn w:val="Normal"/>
     <w:next w:val="Normal"/>
-    <w:link w:val="Heading7Char"/>
+    <w:link w:val="Titre7Car"/>
     <w:uiPriority w:val="9"/>
     <w:semiHidden/>
     <w:unhideWhenUsed/>
@@ -1029,11 +2173,11 @@
       <w:color w:val="595959" w:themeColor="text1" w:themeTint="A6"/>
     </w:rPr>
   </w:style>
-  <w:style w:type="paragraph" w:styleId="Heading8">
+  <w:style w:type="paragraph" w:styleId="Titre8">
     <w:name w:val="heading 8"/>
     <w:basedOn w:val="Normal"/>
     <w:next w:val="Normal"/>
-    <w:link w:val="Heading8Char"/>
+    <w:link w:val="Titre8Car"/>
     <w:uiPriority w:val="9"/>
     <w:semiHidden/>
     <w:unhideWhenUsed/>
@@ -1052,11 +2196,11 @@
       <w:color w:val="272727" w:themeColor="text1" w:themeTint="D8"/>
     </w:rPr>
   </w:style>
-  <w:style w:type="paragraph" w:styleId="Heading9">
+  <w:style w:type="paragraph" w:styleId="Titre9">
     <w:name w:val="heading 9"/>
     <w:basedOn w:val="Normal"/>
     <w:next w:val="Normal"/>
-    <w:link w:val="Heading9Char"/>
+    <w:link w:val="Titre9Car"/>
     <w:uiPriority w:val="9"/>
     <w:semiHidden/>
     <w:unhideWhenUsed/>
@@ -1073,13 +2217,13 @@
       <w:color w:val="272727" w:themeColor="text1" w:themeTint="D8"/>
     </w:rPr>
   </w:style>
-  <w:style w:type="character" w:default="1" w:styleId="DefaultParagraphFont">
+  <w:style w:type="character" w:default="1" w:styleId="Policepardfaut">
     <w:name w:val="Default Paragraph Font"/>
     <w:uiPriority w:val="1"/>
     <w:semiHidden/>
     <w:unhideWhenUsed/>
   </w:style>
-  <w:style w:type="table" w:default="1" w:styleId="TableNormal">
+  <w:style w:type="table" w:default="1" w:styleId="TableauNormal">
     <w:name w:val="Normal Table"/>
     <w:uiPriority w:val="99"/>
     <w:semiHidden/>
@@ -1094,16 +2238,16 @@
       </w:tblCellMar>
     </w:tblPr>
   </w:style>
-  <w:style w:type="numbering" w:default="1" w:styleId="NoList">
+  <w:style w:type="numbering" w:default="1" w:styleId="Aucuneliste">
     <w:name w:val="No List"/>
     <w:uiPriority w:val="99"/>
     <w:semiHidden/>
     <w:unhideWhenUsed/>
   </w:style>
-  <w:style w:type="character" w:customStyle="1" w:styleId="Heading1Char">
-    <w:name w:val="Heading 1 Char"/>
-    <w:basedOn w:val="DefaultParagraphFont"/>
-    <w:link w:val="Heading1"/>
+  <w:style w:type="character" w:customStyle="1" w:styleId="Titre1Car">
+    <w:name w:val="Titre 1 Car"/>
+    <w:basedOn w:val="Policepardfaut"/>
+    <w:link w:val="Titre1"/>
     <w:uiPriority w:val="9"/>
     <w:rsid w:val="00DD2825"/>
     <w:rPr>
@@ -1113,10 +2257,10 @@
       <w:szCs w:val="40"/>
     </w:rPr>
   </w:style>
-  <w:style w:type="character" w:customStyle="1" w:styleId="Heading2Char">
-    <w:name w:val="Heading 2 Char"/>
-    <w:basedOn w:val="DefaultParagraphFont"/>
-    <w:link w:val="Heading2"/>
+  <w:style w:type="character" w:customStyle="1" w:styleId="Titre2Car">
+    <w:name w:val="Titre 2 Car"/>
+    <w:basedOn w:val="Policepardfaut"/>
+    <w:link w:val="Titre2"/>
     <w:uiPriority w:val="9"/>
     <w:semiHidden/>
     <w:rsid w:val="00DD2825"/>
@@ -1127,10 +2271,10 @@
       <w:szCs w:val="32"/>
     </w:rPr>
   </w:style>
-  <w:style w:type="character" w:customStyle="1" w:styleId="Heading3Char">
-    <w:name w:val="Heading 3 Char"/>
-    <w:basedOn w:val="DefaultParagraphFont"/>
-    <w:link w:val="Heading3"/>
+  <w:style w:type="character" w:customStyle="1" w:styleId="Titre3Car">
+    <w:name w:val="Titre 3 Car"/>
+    <w:basedOn w:val="Policepardfaut"/>
+    <w:link w:val="Titre3"/>
     <w:uiPriority w:val="9"/>
     <w:semiHidden/>
     <w:rsid w:val="00DD2825"/>
@@ -1141,10 +2285,10 @@
       <w:szCs w:val="28"/>
     </w:rPr>
   </w:style>
-  <w:style w:type="character" w:customStyle="1" w:styleId="Heading4Char">
-    <w:name w:val="Heading 4 Char"/>
-    <w:basedOn w:val="DefaultParagraphFont"/>
-    <w:link w:val="Heading4"/>
+  <w:style w:type="character" w:customStyle="1" w:styleId="Titre4Car">
+    <w:name w:val="Titre 4 Car"/>
+    <w:basedOn w:val="Policepardfaut"/>
+    <w:link w:val="Titre4"/>
     <w:uiPriority w:val="9"/>
     <w:semiHidden/>
     <w:rsid w:val="00DD2825"/>
@@ -1155,10 +2299,10 @@
       <w:color w:val="0F4761" w:themeColor="accent1" w:themeShade="BF"/>
     </w:rPr>
   </w:style>
-  <w:style w:type="character" w:customStyle="1" w:styleId="Heading5Char">
-    <w:name w:val="Heading 5 Char"/>
-    <w:basedOn w:val="DefaultParagraphFont"/>
-    <w:link w:val="Heading5"/>
+  <w:style w:type="character" w:customStyle="1" w:styleId="Titre5Car">
+    <w:name w:val="Titre 5 Car"/>
+    <w:basedOn w:val="Policepardfaut"/>
+    <w:link w:val="Titre5"/>
     <w:uiPriority w:val="9"/>
     <w:semiHidden/>
     <w:rsid w:val="00DD2825"/>
@@ -1167,10 +2311,10 @@
       <w:color w:val="0F4761" w:themeColor="accent1" w:themeShade="BF"/>
     </w:rPr>
   </w:style>
-  <w:style w:type="character" w:customStyle="1" w:styleId="Heading6Char">
-    <w:name w:val="Heading 6 Char"/>
-    <w:basedOn w:val="DefaultParagraphFont"/>
-    <w:link w:val="Heading6"/>
+  <w:style w:type="character" w:customStyle="1" w:styleId="Titre6Car">
+    <w:name w:val="Titre 6 Car"/>
+    <w:basedOn w:val="Policepardfaut"/>
+    <w:link w:val="Titre6"/>
     <w:uiPriority w:val="9"/>
     <w:semiHidden/>
     <w:rsid w:val="00DD2825"/>
@@ -1181,10 +2325,10 @@
       <w:color w:val="595959" w:themeColor="text1" w:themeTint="A6"/>
     </w:rPr>
   </w:style>
-  <w:style w:type="character" w:customStyle="1" w:styleId="Heading7Char">
-    <w:name w:val="Heading 7 Char"/>
-    <w:basedOn w:val="DefaultParagraphFont"/>
-    <w:link w:val="Heading7"/>
+  <w:style w:type="character" w:customStyle="1" w:styleId="Titre7Car">
+    <w:name w:val="Titre 7 Car"/>
+    <w:basedOn w:val="Policepardfaut"/>
+    <w:link w:val="Titre7"/>
     <w:uiPriority w:val="9"/>
     <w:semiHidden/>
     <w:rsid w:val="00DD2825"/>
@@ -1193,10 +2337,10 @@
       <w:color w:val="595959" w:themeColor="text1" w:themeTint="A6"/>
     </w:rPr>
   </w:style>
-  <w:style w:type="character" w:customStyle="1" w:styleId="Heading8Char">
-    <w:name w:val="Heading 8 Char"/>
-    <w:basedOn w:val="DefaultParagraphFont"/>
-    <w:link w:val="Heading8"/>
+  <w:style w:type="character" w:customStyle="1" w:styleId="Titre8Car">
+    <w:name w:val="Titre 8 Car"/>
+    <w:basedOn w:val="Policepardfaut"/>
+    <w:link w:val="Titre8"/>
     <w:uiPriority w:val="9"/>
     <w:semiHidden/>
     <w:rsid w:val="00DD2825"/>
@@ -1207,10 +2351,10 @@
       <w:color w:val="272727" w:themeColor="text1" w:themeTint="D8"/>
     </w:rPr>
   </w:style>
-  <w:style w:type="character" w:customStyle="1" w:styleId="Heading9Char">
-    <w:name w:val="Heading 9 Char"/>
-    <w:basedOn w:val="DefaultParagraphFont"/>
-    <w:link w:val="Heading9"/>
+  <w:style w:type="character" w:customStyle="1" w:styleId="Titre9Car">
+    <w:name w:val="Titre 9 Car"/>
+    <w:basedOn w:val="Policepardfaut"/>
+    <w:link w:val="Titre9"/>
     <w:uiPriority w:val="9"/>
     <w:semiHidden/>
     <w:rsid w:val="00DD2825"/>
@@ -1219,11 +2363,11 @@
       <w:color w:val="272727" w:themeColor="text1" w:themeTint="D8"/>
     </w:rPr>
   </w:style>
-  <w:style w:type="paragraph" w:styleId="Title">
+  <w:style w:type="paragraph" w:styleId="Titre">
     <w:name w:val="Title"/>
     <w:basedOn w:val="Normal"/>
     <w:next w:val="Normal"/>
-    <w:link w:val="TitleChar"/>
+    <w:link w:val="TitreCar"/>
     <w:uiPriority w:val="10"/>
     <w:qFormat/>
     <w:rsid w:val="00DD2825"/>
@@ -1239,10 +2383,10 @@
       <w:szCs w:val="56"/>
     </w:rPr>
   </w:style>
-  <w:style w:type="character" w:customStyle="1" w:styleId="TitleChar">
-    <w:name w:val="Title Char"/>
-    <w:basedOn w:val="DefaultParagraphFont"/>
-    <w:link w:val="Title"/>
+  <w:style w:type="character" w:customStyle="1" w:styleId="TitreCar">
+    <w:name w:val="Titre Car"/>
+    <w:basedOn w:val="Policepardfaut"/>
+    <w:link w:val="Titre"/>
     <w:uiPriority w:val="10"/>
     <w:rsid w:val="00DD2825"/>
     <w:rPr>
@@ -1253,11 +2397,11 @@
       <w:szCs w:val="56"/>
     </w:rPr>
   </w:style>
-  <w:style w:type="paragraph" w:styleId="Subtitle">
+  <w:style w:type="paragraph" w:styleId="Sous-titre">
     <w:name w:val="Subtitle"/>
     <w:basedOn w:val="Normal"/>
     <w:next w:val="Normal"/>
-    <w:link w:val="SubtitleChar"/>
+    <w:link w:val="Sous-titreCar"/>
     <w:uiPriority w:val="11"/>
     <w:qFormat/>
     <w:rsid w:val="00DD2825"/>
@@ -1274,10 +2418,10 @@
       <w:szCs w:val="28"/>
     </w:rPr>
   </w:style>
-  <w:style w:type="character" w:customStyle="1" w:styleId="SubtitleChar">
-    <w:name w:val="Subtitle Char"/>
-    <w:basedOn w:val="DefaultParagraphFont"/>
-    <w:link w:val="Subtitle"/>
+  <w:style w:type="character" w:customStyle="1" w:styleId="Sous-titreCar">
+    <w:name w:val="Sous-titre Car"/>
+    <w:basedOn w:val="Policepardfaut"/>
+    <w:link w:val="Sous-titre"/>
     <w:uiPriority w:val="11"/>
     <w:rsid w:val="00DD2825"/>
     <w:rPr>
@@ -1288,11 +2432,11 @@
       <w:szCs w:val="28"/>
     </w:rPr>
   </w:style>
-  <w:style w:type="paragraph" w:styleId="Quote">
+  <w:style w:type="paragraph" w:styleId="Citation">
     <w:name w:val="Quote"/>
     <w:basedOn w:val="Normal"/>
     <w:next w:val="Normal"/>
-    <w:link w:val="QuoteChar"/>
+    <w:link w:val="CitationCar"/>
     <w:uiPriority w:val="29"/>
     <w:qFormat/>
     <w:rsid w:val="00DD2825"/>
@@ -1306,10 +2450,10 @@
       <w:color w:val="404040" w:themeColor="text1" w:themeTint="BF"/>
     </w:rPr>
   </w:style>
-  <w:style w:type="character" w:customStyle="1" w:styleId="QuoteChar">
-    <w:name w:val="Quote Char"/>
-    <w:basedOn w:val="DefaultParagraphFont"/>
-    <w:link w:val="Quote"/>
+  <w:style w:type="character" w:customStyle="1" w:styleId="CitationCar">
+    <w:name w:val="Citation Car"/>
+    <w:basedOn w:val="Policepardfaut"/>
+    <w:link w:val="Citation"/>
     <w:uiPriority w:val="29"/>
     <w:rsid w:val="00DD2825"/>
     <w:rPr>
@@ -1318,7 +2462,7 @@
       <w:color w:val="404040" w:themeColor="text1" w:themeTint="BF"/>
     </w:rPr>
   </w:style>
-  <w:style w:type="paragraph" w:styleId="ListParagraph">
+  <w:style w:type="paragraph" w:styleId="Paragraphedeliste">
     <w:name w:val="List Paragraph"/>
     <w:basedOn w:val="Normal"/>
     <w:uiPriority w:val="34"/>
@@ -1329,9 +2473,9 @@
       <w:contextualSpacing/>
     </w:pPr>
   </w:style>
-  <w:style w:type="character" w:styleId="IntenseEmphasis">
+  <w:style w:type="character" w:styleId="Accentuationintense">
     <w:name w:val="Intense Emphasis"/>
-    <w:basedOn w:val="DefaultParagraphFont"/>
+    <w:basedOn w:val="Policepardfaut"/>
     <w:uiPriority w:val="21"/>
     <w:qFormat/>
     <w:rsid w:val="00DD2825"/>
@@ -1341,11 +2485,11 @@
       <w:color w:val="0F4761" w:themeColor="accent1" w:themeShade="BF"/>
     </w:rPr>
   </w:style>
-  <w:style w:type="paragraph" w:styleId="IntenseQuote">
+  <w:style w:type="paragraph" w:styleId="Citationintense">
     <w:name w:val="Intense Quote"/>
     <w:basedOn w:val="Normal"/>
     <w:next w:val="Normal"/>
-    <w:link w:val="IntenseQuoteChar"/>
+    <w:link w:val="CitationintenseCar"/>
     <w:uiPriority w:val="30"/>
     <w:qFormat/>
     <w:rsid w:val="00DD2825"/>
@@ -1364,10 +2508,10 @@
       <w:color w:val="0F4761" w:themeColor="accent1" w:themeShade="BF"/>
     </w:rPr>
   </w:style>
-  <w:style w:type="character" w:customStyle="1" w:styleId="IntenseQuoteChar">
-    <w:name w:val="Intense Quote Char"/>
-    <w:basedOn w:val="DefaultParagraphFont"/>
-    <w:link w:val="IntenseQuote"/>
+  <w:style w:type="character" w:customStyle="1" w:styleId="CitationintenseCar">
+    <w:name w:val="Citation intense Car"/>
+    <w:basedOn w:val="Policepardfaut"/>
+    <w:link w:val="Citationintense"/>
     <w:uiPriority w:val="30"/>
     <w:rsid w:val="00DD2825"/>
     <w:rPr>
@@ -1376,9 +2520,9 @@
       <w:color w:val="0F4761" w:themeColor="accent1" w:themeShade="BF"/>
     </w:rPr>
   </w:style>
-  <w:style w:type="character" w:styleId="IntenseReference">
+  <w:style w:type="character" w:styleId="Rfrenceintense">
     <w:name w:val="Intense Reference"/>
-    <w:basedOn w:val="DefaultParagraphFont"/>
+    <w:basedOn w:val="Policepardfaut"/>
     <w:uiPriority w:val="32"/>
     <w:qFormat/>
     <w:rsid w:val="00DD2825"/>
@@ -1388,6 +2532,25 @@
       <w:smallCaps/>
       <w:color w:val="0F4761" w:themeColor="accent1" w:themeShade="BF"/>
       <w:spacing w:val="5"/>
+    </w:rPr>
+  </w:style>
+  <w:style w:type="paragraph" w:styleId="Lgende">
+    <w:name w:val="caption"/>
+    <w:basedOn w:val="Normal"/>
+    <w:next w:val="Normal"/>
+    <w:uiPriority w:val="35"/>
+    <w:unhideWhenUsed/>
+    <w:qFormat/>
+    <w:rsid w:val="00B979CA"/>
+    <w:pPr>
+      <w:spacing w:after="200" w:line="240" w:lineRule="auto"/>
+    </w:pPr>
+    <w:rPr>
+      <w:i/>
+      <w:iCs/>
+      <w:color w:val="0E2841" w:themeColor="text2"/>
+      <w:sz w:val="18"/>
+      <w:szCs w:val="18"/>
     </w:rPr>
   </w:style>
 </w:styles>

</xml_diff>

<commit_message>
Add github link to report
</commit_message>
<xml_diff>
--- a/doc/report.docx
+++ b/doc/report.docx
@@ -382,6 +382,38 @@
           <w:lang w:val="fr-CH"/>
         </w:rPr>
       </w:pPr>
+    </w:p>
+    <w:p>
+      <w:pPr>
+        <w:jc w:val="both"/>
+        <w:rPr>
+          <w:lang w:val="fr-CH"/>
+        </w:rPr>
+      </w:pPr>
+      <w:r>
+        <w:rPr>
+          <w:lang w:val="fr-CH"/>
+        </w:rPr>
+        <w:t>Le code source peut être consulté dans le GitHub du projet :</w:t>
+      </w:r>
+    </w:p>
+    <w:p>
+      <w:pPr>
+        <w:ind w:firstLine="720"/>
+        <w:jc w:val="both"/>
+        <w:rPr>
+          <w:lang w:val="fr-CH"/>
+        </w:rPr>
+      </w:pPr>
+      <w:hyperlink r:id="rId5" w:history="1">
+        <w:r>
+          <w:rPr>
+            <w:rStyle w:val="Hyperlink"/>
+            <w:lang w:val="fr-CH"/>
+          </w:rPr>
+          <w:t>https://github.com/RobinSteiger/ASAD</w:t>
+        </w:r>
+      </w:hyperlink>
       <w:r>
         <w:rPr>
           <w:b/>
@@ -504,24 +536,14 @@
                             <w:r>
                               <w:t xml:space="preserve">Figure </w:t>
                             </w:r>
-                            <w:r>
-                              <w:fldChar w:fldCharType="begin"/>
-                            </w:r>
-                            <w:r>
-                              <w:instrText xml:space="preserve"> SEQ Figure \* ARABIC </w:instrText>
-                            </w:r>
-                            <w:r>
-                              <w:fldChar w:fldCharType="separate"/>
-                            </w:r>
-                            <w:r>
-                              <w:rPr>
-                                <w:noProof/>
-                              </w:rPr>
-                              <w:t>1</w:t>
-                            </w:r>
-                            <w:r>
-                              <w:fldChar w:fldCharType="end"/>
-                            </w:r>
+                            <w:fldSimple w:instr=" SEQ Figure \* ARABIC ">
+                              <w:r>
+                                <w:rPr>
+                                  <w:noProof/>
+                                </w:rPr>
+                                <w:t>1</w:t>
+                              </w:r>
+                            </w:fldSimple>
                             <w:r>
                               <w:rPr>
                                 <w:lang w:val="fr-FR"/>
@@ -692,7 +714,7 @@
                     </pic:cNvPicPr>
                   </pic:nvPicPr>
                   <pic:blipFill>
-                    <a:blip r:embed="rId5">
+                    <a:blip r:embed="rId6">
                       <a:extLst>
                         <a:ext uri="{28A0092B-C50C-407E-A947-70E740481C1C}">
                           <a14:useLocalDpi xmlns:a14="http://schemas.microsoft.com/office/drawing/2010/main" val="0"/>
@@ -1030,19 +1052,7 @@
                               <w:rPr>
                                 <w:lang w:val="fr-FR"/>
                               </w:rPr>
-                              <w:t xml:space="preserve"> </w:t>
-                            </w:r>
-                            <w:r>
-                              <w:rPr>
-                                <w:lang w:val="fr-FR"/>
-                              </w:rPr>
-                              <w:t>Data Flow</w:t>
-                            </w:r>
-                            <w:r>
-                              <w:rPr>
-                                <w:lang w:val="fr-FR"/>
-                              </w:rPr>
-                              <w:t xml:space="preserve"> Diagram</w:t>
+                              <w:t xml:space="preserve"> Data Flow Diagram</w:t>
                             </w:r>
                           </w:p>
                         </w:txbxContent>
@@ -1145,7 +1155,7 @@
                     </pic:cNvPicPr>
                   </pic:nvPicPr>
                   <pic:blipFill>
-                    <a:blip r:embed="rId6">
+                    <a:blip r:embed="rId7">
                       <a:extLst>
                         <a:ext uri="{28A0092B-C50C-407E-A947-70E740481C1C}">
                           <a14:useLocalDpi xmlns:a14="http://schemas.microsoft.com/office/drawing/2010/main" val="0"/>
@@ -1357,24 +1367,14 @@
                             <w:r>
                               <w:t xml:space="preserve">Figure </w:t>
                             </w:r>
-                            <w:r>
-                              <w:fldChar w:fldCharType="begin"/>
-                            </w:r>
-                            <w:r>
-                              <w:instrText xml:space="preserve"> SEQ Figure \* ARABIC </w:instrText>
-                            </w:r>
-                            <w:r>
-                              <w:fldChar w:fldCharType="separate"/>
-                            </w:r>
-                            <w:r>
-                              <w:rPr>
-                                <w:noProof/>
-                              </w:rPr>
-                              <w:t>3</w:t>
-                            </w:r>
-                            <w:r>
-                              <w:fldChar w:fldCharType="end"/>
-                            </w:r>
+                            <w:fldSimple w:instr=" SEQ Figure \* ARABIC ">
+                              <w:r>
+                                <w:rPr>
+                                  <w:noProof/>
+                                </w:rPr>
+                                <w:t>3</w:t>
+                              </w:r>
+                            </w:fldSimple>
                             <w:r>
                               <w:rPr>
                                 <w:lang w:val="fr-FR"/>
@@ -1556,7 +1556,7 @@
                     </pic:cNvPicPr>
                   </pic:nvPicPr>
                   <pic:blipFill>
-                    <a:blip r:embed="rId7" cstate="print">
+                    <a:blip r:embed="rId8" cstate="print">
                       <a:extLst>
                         <a:ext uri="{28A0092B-C50C-407E-A947-70E740481C1C}">
                           <a14:useLocalDpi xmlns:a14="http://schemas.microsoft.com/office/drawing/2010/main" val="0"/>
@@ -1759,13 +1759,7 @@
                               <w:rPr>
                                 <w:lang w:val="fr-FR"/>
                               </w:rPr>
-                              <w:t xml:space="preserve"> </w:t>
-                            </w:r>
-                            <w:r>
-                              <w:rPr>
-                                <w:lang w:val="fr-FR"/>
-                              </w:rPr>
-                              <w:t>Diagramme de composant</w:t>
+                              <w:t xml:space="preserve"> Diagramme de composant</w:t>
                             </w:r>
                           </w:p>
                         </w:txbxContent>
@@ -1861,7 +1855,7 @@
                     </pic:cNvPicPr>
                   </pic:nvPicPr>
                   <pic:blipFill>
-                    <a:blip r:embed="rId8">
+                    <a:blip r:embed="rId9">
                       <a:extLst>
                         <a:ext uri="{28A0092B-C50C-407E-A947-70E740481C1C}">
                           <a14:useLocalDpi xmlns:a14="http://schemas.microsoft.com/office/drawing/2010/main" val="0"/>
@@ -2002,7 +1996,7 @@
                     </pic:cNvPicPr>
                   </pic:nvPicPr>
                   <pic:blipFill>
-                    <a:blip r:embed="rId9">
+                    <a:blip r:embed="rId10">
                       <a:extLst>
                         <a:ext uri="{28A0092B-C50C-407E-A947-70E740481C1C}">
                           <a14:useLocalDpi xmlns:a14="http://schemas.microsoft.com/office/drawing/2010/main" val="0"/>
@@ -2097,10 +2091,7 @@
                               </w:rPr>
                             </w:pPr>
                             <w:r>
-                              <w:t>Figure</w:t>
-                            </w:r>
-                            <w:r>
-                              <w:t xml:space="preserve"> </w:t>
+                              <w:t xml:space="preserve">Figure </w:t>
                             </w:r>
                             <w:proofErr w:type="gramStart"/>
                             <w:r>
@@ -2255,7 +2246,7 @@
                     </pic:cNvPicPr>
                   </pic:nvPicPr>
                   <pic:blipFill>
-                    <a:blip r:embed="rId10">
+                    <a:blip r:embed="rId11">
                       <a:extLst>
                         <a:ext uri="{28A0092B-C50C-407E-A947-70E740481C1C}">
                           <a14:useLocalDpi xmlns:a14="http://schemas.microsoft.com/office/drawing/2010/main" val="0"/>
@@ -2462,13 +2453,7 @@
                               <w:rPr>
                                 <w:lang w:val="fr-FR"/>
                               </w:rPr>
-                              <w:t xml:space="preserve"> Diagramme de </w:t>
-                            </w:r>
-                            <w:r>
-                              <w:rPr>
-                                <w:lang w:val="fr-FR"/>
-                              </w:rPr>
-                              <w:t>Déploiement</w:t>
+                              <w:t xml:space="preserve"> Diagramme de Déploiement</w:t>
                             </w:r>
                           </w:p>
                         </w:txbxContent>
@@ -3488,6 +3473,11 @@
       </w:r>
     </w:p>
     <w:p>
+      <w:pPr>
+        <w:rPr>
+          <w:lang w:val="fr-CH"/>
+        </w:rPr>
+      </w:pPr>
       <w:r>
         <w:rPr>
           <w:b/>
@@ -3505,6 +3495,9 @@
         <w:t>Améliorations futures</w:t>
       </w:r>
       <w:r>
+        <w:rPr>
+          <w:lang w:val="fr-CH"/>
+        </w:rPr>
         <w:t> </w:t>
       </w:r>
     </w:p>
@@ -6959,6 +6952,7 @@
   <w:style w:type="character" w:default="1" w:styleId="DefaultParagraphFont">
     <w:name w:val="Default Paragraph Font"/>
     <w:uiPriority w:val="1"/>
+    <w:semiHidden/>
     <w:unhideWhenUsed/>
   </w:style>
   <w:style w:type="table" w:default="1" w:styleId="TableNormal">
@@ -7291,6 +7285,29 @@
       <w:szCs w:val="18"/>
     </w:rPr>
   </w:style>
+  <w:style w:type="character" w:styleId="Hyperlink">
+    <w:name w:val="Hyperlink"/>
+    <w:basedOn w:val="DefaultParagraphFont"/>
+    <w:uiPriority w:val="99"/>
+    <w:unhideWhenUsed/>
+    <w:rsid w:val="006A587F"/>
+    <w:rPr>
+      <w:color w:val="467886" w:themeColor="hyperlink"/>
+      <w:u w:val="single"/>
+    </w:rPr>
+  </w:style>
+  <w:style w:type="character" w:styleId="UnresolvedMention">
+    <w:name w:val="Unresolved Mention"/>
+    <w:basedOn w:val="DefaultParagraphFont"/>
+    <w:uiPriority w:val="99"/>
+    <w:semiHidden/>
+    <w:unhideWhenUsed/>
+    <w:rsid w:val="006A587F"/>
+    <w:rPr>
+      <w:color w:val="605E5C"/>
+      <w:shd w:val="clear" w:color="auto" w:fill="E1DFDD"/>
+    </w:rPr>
+  </w:style>
 </w:styles>
 </file>
 

</xml_diff>